<commit_message>
Laborator site: opravy podle rady
- jeden postovni svet prirovnani (klient odesilatel, server adresat,
  internet tridirny, vnitrni a verejna adresa byt a dum misto hotelu)
- oznacena zjednoduseni v modulech 02 a 06, IP adresa se muze menit
- modul 07 vyjmut do samostatne stranky k hodine 6, tracert opraven
  (posledni radek je server), upozorneni na blokovany ping ve skole
- texty pro novacka: obalka = paket, tlacitko Odeslat (Enter),
  Bonus misto Pro rychliky, poznamka pro ucitele v paticce
- plan hodiny 4: modul 05 ve fazi 14-22 misto kresleni na tabuli
- plan hodiny 6: bonus Sit naostro v pomuckach

Co-Authored-By: Claude Opus 5.5 <noreply@anthropic.com>
Claude-Session: https://claude.ai/code/session_01QhSRJEZwDnvy4KLvEMivYU
</commit_message>
<xml_diff>
--- a/public/materialy/1L/2/_ucitel/6. Příkazový řádek - plán hodiny.docx
+++ b/public/materialy/1L/2/_ucitel/6. Příkazový řádek - plán hodiny.docx
@@ -734,6 +734,27 @@
       <w:proofErr w:type="spellEnd"/>
       <w:r>
         <w:t>/syntax (pozor, je psán pro vývojáře v .NET; využitelná je úvodní část o příkazech, možnostech a argumentech).</w:t>
+      </w:r>
+    </w:p>
+    <w:p>
+      <w:pPr>
+        <w:pStyle w:val="Odstavecseseznamem"/>
+        <w:numPr>
+          <w:ilvl w:val="0"/>
+          <w:numId w:val="2"/>
+        </w:numPr>
+        <w:spacing w:after="40"/>
+      </w:pPr>
+      <w:proofErr w:type="spellStart"/>
+      <w:proofErr w:type="spellEnd"/>
+      <w:proofErr w:type="spellStart"/>
+      <w:proofErr w:type="spellEnd"/>
+      <w:proofErr w:type="spellStart"/>
+      <w:proofErr w:type="spellEnd"/>
+      <w:proofErr w:type="spellStart"/>
+      <w:proofErr w:type="spellEnd"/>
+      <w:r>
+        <w:t xml:space="preserve">Bonus pro rychlíky navazující na hodinu 4: stránka Síť naostro v příkazovém řádku (banka → Podklady k aktivitám) — ipconfig, nslookup, tracert a ping s vysvětlením výpisu. Předem ověř, že ping a tracert školní síť neblokuje.</w:t>
       </w:r>
     </w:p>
     <w:p>

</xml_diff>